<commit_message>
Refresh week 1–2 Classroom pack README and rebuilds.
</commit_message>
<xml_diff>
--- a/kurs/classroom-pack/vecka-01/lektion-1.1-stotar.docx
+++ b/kurs/classroom-pack/vecka-01/lektion-1.1-stotar.docx
@@ -526,7 +526,20 @@
           <w:color w:val="111111"/>
           <w:sz w:val="21"/>
         </w:rPr>
-        <w:t xml:space="preserve"> På given tavla/pump pekar ut stötväg och minst en skyddsåtgärd. Säger att ELSÄK-installationsregler inte styr ombord, och att personskydd oftast inte är JFB. Kopplar en SMS-punkt (packning, jord, eller krets utanför IR-vakt). </w:t>
+        <w:t xml:space="preserve"> På given tavla/pump pekar ut stötväg och minst en skyddsåtgärd. Säger att ELSÄK-installationsregler inte styr ombord, och att personskydd oftast inte är JFB. Kopplar en SMS-punkt (packning, jord, eller krets utanför IR-vakt).</w:t>
+      </w:r>
+    </w:p>
+    <w:p>
+      <w:pPr>
+        <w:spacing w:before="0" w:after="120" w:line="276" w:lineRule="auto"/>
+      </w:pPr>
+      <w:r>
+        <w:rPr>
+          <w:rFonts w:ascii="IBM Plex Sans" w:hAnsi="IBM Plex Sans" w:eastAsia="IBM Plex Sans" w:cs="IBM Plex Sans"/>
+          <w:b w:val="0"/>
+          <w:color w:val="111111"/>
+          <w:sz w:val="21"/>
+        </w:rPr>
       </w:r>
       <w:r>
         <w:rPr>
@@ -544,7 +557,20 @@
           <w:color w:val="111111"/>
           <w:sz w:val="21"/>
         </w:rPr>
-        <w:t xml:space="preserve"> Skriver själv en kort motiverad riskbedömning mot SHK-fallet: fara, varför IR-vakten var tyst, vad eleven gör innan beröring, varför just den åtgärden. Nämner stöt → sjukvård iland. </w:t>
+        <w:t xml:space="preserve"> Skriver själv en kort motiverad riskbedömning mot SHK-fallet: fara, varför IR-vakten var tyst, vad eleven gör innan beröring, varför just den åtgärden. Nämner stöt → sjukvård iland.</w:t>
+      </w:r>
+    </w:p>
+    <w:p>
+      <w:pPr>
+        <w:spacing w:before="0" w:after="120" w:line="276" w:lineRule="auto"/>
+      </w:pPr>
+      <w:r>
+        <w:rPr>
+          <w:rFonts w:ascii="IBM Plex Sans" w:hAnsi="IBM Plex Sans" w:eastAsia="IBM Plex Sans" w:cs="IBM Plex Sans"/>
+          <w:b w:val="0"/>
+          <w:color w:val="111111"/>
+          <w:sz w:val="21"/>
+        </w:rPr>
       </w:r>
       <w:r>
         <w:rPr>
@@ -617,7 +643,20 @@
           <w:color w:val="111111"/>
           <w:sz w:val="21"/>
         </w:rPr>
-        <w:t xml:space="preserve"> PE, JFB, SS 436 40 00, ELSÄK-auktorisation som identitet. </w:t>
+        <w:t xml:space="preserve"> PE, JFB, SS 436 40 00, ELSÄK-auktorisation som identitet.</w:t>
+      </w:r>
+    </w:p>
+    <w:p>
+      <w:pPr>
+        <w:spacing w:before="0" w:after="120" w:line="276" w:lineRule="auto"/>
+      </w:pPr>
+      <w:r>
+        <w:rPr>
+          <w:rFonts w:ascii="IBM Plex Sans" w:hAnsi="IBM Plex Sans" w:eastAsia="IBM Plex Sans" w:cs="IBM Plex Sans"/>
+          <w:b w:val="0"/>
+          <w:color w:val="111111"/>
+          <w:sz w:val="21"/>
+        </w:rPr>
       </w:r>
       <w:r>
         <w:rPr>
@@ -654,7 +693,20 @@
           <w:color w:val="111111"/>
           <w:sz w:val="21"/>
         </w:rPr>
-        <w:t xml:space="preserve"> (inte frånkoppling). En lokalt jordad sidokrets syns inte på IR-vakten. </w:t>
+        <w:t xml:space="preserve"> (inte frånkoppling). En lokalt jordad sidokrets syns inte på IR-vakten.</w:t>
+      </w:r>
+    </w:p>
+    <w:p>
+      <w:pPr>
+        <w:spacing w:before="0" w:after="120" w:line="276" w:lineRule="auto"/>
+      </w:pPr>
+      <w:r>
+        <w:rPr>
+          <w:rFonts w:ascii="IBM Plex Sans" w:hAnsi="IBM Plex Sans" w:eastAsia="IBM Plex Sans" w:cs="IBM Plex Sans"/>
+          <w:b w:val="0"/>
+          <w:color w:val="111111"/>
+          <w:sz w:val="21"/>
+        </w:rPr>
       </w:r>
       <w:r>
         <w:rPr>
@@ -672,7 +724,20 @@
           <w:color w:val="111111"/>
           <w:sz w:val="21"/>
         </w:rPr>
-        <w:t xml:space="preserve"> rummet, barlastpumpen, att leta läckage med händerna. </w:t>
+        <w:t xml:space="preserve"> rummet, barlastpumpen, att leta läckage med händerna.</w:t>
+      </w:r>
+    </w:p>
+    <w:p>
+      <w:pPr>
+        <w:spacing w:before="0" w:after="120" w:line="276" w:lineRule="auto"/>
+      </w:pPr>
+      <w:r>
+        <w:rPr>
+          <w:rFonts w:ascii="IBM Plex Sans" w:hAnsi="IBM Plex Sans" w:eastAsia="IBM Plex Sans" w:cs="IBM Plex Sans"/>
+          <w:b w:val="0"/>
+          <w:color w:val="111111"/>
+          <w:sz w:val="21"/>
+        </w:rPr>
       </w:r>
       <w:r>
         <w:rPr>
@@ -2373,7 +2438,20 @@
           <w:color w:val="111111"/>
           <w:sz w:val="21"/>
         </w:rPr>
-        <w:t xml:space="preserve"> ro-ro / last, stål. Scenario = Germanica-parafras, inte namngivet övningsfartyg på intyget. </w:t>
+        <w:t xml:space="preserve"> ro-ro / last, stål. Scenario = Germanica-parafras, inte namngivet övningsfartyg på intyget.</w:t>
+      </w:r>
+    </w:p>
+    <w:p>
+      <w:pPr>
+        <w:spacing w:before="0" w:after="120" w:line="276" w:lineRule="auto"/>
+      </w:pPr>
+      <w:r>
+        <w:rPr>
+          <w:rFonts w:ascii="IBM Plex Sans" w:hAnsi="IBM Plex Sans" w:eastAsia="IBM Plex Sans" w:cs="IBM Plex Sans"/>
+          <w:b w:val="0"/>
+          <w:color w:val="111111"/>
+          <w:sz w:val="21"/>
+        </w:rPr>
       </w:r>
       <w:r>
         <w:rPr>
@@ -2391,7 +2469,20 @@
           <w:color w:val="111111"/>
           <w:sz w:val="21"/>
         </w:rPr>
-        <w:t xml:space="preserve"> pannrum, barlastpump, magnetventil (labbmodell eller foto/uppställning med tydlig packning, jord, och en krets märkt ”utanför IR”). </w:t>
+        <w:t xml:space="preserve"> pannrum, barlastpump, magnetventil (labbmodell eller foto/uppställning med tydlig packning, jord, och en krets märkt ”utanför IR”).</w:t>
+      </w:r>
+    </w:p>
+    <w:p>
+      <w:pPr>
+        <w:spacing w:before="0" w:after="120" w:line="276" w:lineRule="auto"/>
+      </w:pPr>
+      <w:r>
+        <w:rPr>
+          <w:rFonts w:ascii="IBM Plex Sans" w:hAnsi="IBM Plex Sans" w:eastAsia="IBM Plex Sans" w:cs="IBM Plex Sans"/>
+          <w:b w:val="0"/>
+          <w:color w:val="111111"/>
+          <w:sz w:val="21"/>
+        </w:rPr>
       </w:r>
       <w:r>
         <w:rPr>
@@ -2409,7 +2500,20 @@
           <w:color w:val="111111"/>
           <w:sz w:val="21"/>
         </w:rPr>
-        <w:t xml:space="preserve"> ”Det läcker vid pumpen, känn efter var.” </w:t>
+        <w:t xml:space="preserve"> ”Det läcker vid pumpen, känn efter var.”</w:t>
+      </w:r>
+    </w:p>
+    <w:p>
+      <w:pPr>
+        <w:spacing w:before="0" w:after="120" w:line="276" w:lineRule="auto"/>
+      </w:pPr>
+      <w:r>
+        <w:rPr>
+          <w:rFonts w:ascii="IBM Plex Sans" w:hAnsi="IBM Plex Sans" w:eastAsia="IBM Plex Sans" w:cs="IBM Plex Sans"/>
+          <w:b w:val="0"/>
+          <w:color w:val="111111"/>
+          <w:sz w:val="21"/>
+        </w:rPr>
       </w:r>
       <w:r>
         <w:rPr>
@@ -2682,7 +2786,20 @@
           <w:color w:val="111111"/>
           <w:sz w:val="21"/>
         </w:rPr>
-        <w:t xml:space="preserve">Inte intyg till befälhavaren (m11). Inte TS-blankett (GAP). </w:t>
+        <w:t>Inte intyg till befälhavaren (m11). Inte TS-blankett (GAP).</w:t>
+      </w:r>
+    </w:p>
+    <w:p>
+      <w:pPr>
+        <w:spacing w:before="0" w:after="120" w:line="276" w:lineRule="auto"/>
+      </w:pPr>
+      <w:r>
+        <w:rPr>
+          <w:rFonts w:ascii="IBM Plex Sans" w:hAnsi="IBM Plex Sans" w:eastAsia="IBM Plex Sans" w:cs="IBM Plex Sans"/>
+          <w:b w:val="0"/>
+          <w:color w:val="111111"/>
+          <w:sz w:val="21"/>
+        </w:rPr>
       </w:r>
       <w:r>
         <w:rPr>
@@ -2700,7 +2817,20 @@
           <w:color w:val="111111"/>
           <w:sz w:val="21"/>
         </w:rPr>
-        <w:t xml:space="preserve"> labbprotokoll: namn, stötväg, två fel, en SMS-punkt. </w:t>
+        <w:t xml:space="preserve"> labbprotokoll: namn, stötväg, två fel, en SMS-punkt.</w:t>
+      </w:r>
+    </w:p>
+    <w:p>
+      <w:pPr>
+        <w:spacing w:before="0" w:after="120" w:line="276" w:lineRule="auto"/>
+      </w:pPr>
+      <w:r>
+        <w:rPr>
+          <w:rFonts w:ascii="IBM Plex Sans" w:hAnsi="IBM Plex Sans" w:eastAsia="IBM Plex Sans" w:cs="IBM Plex Sans"/>
+          <w:b w:val="0"/>
+          <w:color w:val="111111"/>
+          <w:sz w:val="21"/>
+        </w:rPr>
       </w:r>
       <w:r>
         <w:rPr>

</xml_diff>